<commit_message>
updated few things in the document
</commit_message>
<xml_diff>
--- a/report/sequence_alignment_report_restructured.docx
+++ b/report/sequence_alignment_report_restructured.docx
@@ -1285,67 +1285,13 @@
         <w:spacing w:after="120"/>
       </w:pPr>
       <w:r>
-        <w:t>Appendix A: Selected FASTA headers used in the study</w:t>
+        <w:t xml:space="preserve">Appendix </w:t>
       </w:r>
-    </w:p>
-    <w:p>
-      <w:pPr>
-        <w:spacing w:after="120"/>
-      </w:pPr>
       <w:r>
-        <w:rPr>
-          <w:i/>
-        </w:rPr>
-        <w:t>(Insert 3-5 representative FASTA headers from your dataset)</w:t>
+        <w:t>A</w:t>
       </w:r>
-    </w:p>
-    <w:p>
-      <w:pPr>
-        <w:pStyle w:val="Heading2"/>
-        <w:spacing w:after="120"/>
-      </w:pPr>
       <w:r>
-        <w:t>Appendix B: Example pairwise alignment output</w:t>
-      </w:r>
-    </w:p>
-    <w:p>
-      <w:pPr>
-        <w:spacing w:after="120"/>
-      </w:pPr>
-      <w:r>
-        <w:rPr>
-          <w:i/>
-        </w:rPr>
-        <w:t>(Insert a short excerpt from Human vs Zebrafish global alignment)</w:t>
-      </w:r>
-    </w:p>
-    <w:p>
-      <w:pPr>
-        <w:pStyle w:val="Heading2"/>
-        <w:spacing w:after="120"/>
-      </w:pPr>
-      <w:r>
-        <w:t>Appendix C: Consensus sequence generated from MUSCLE MSA</w:t>
-      </w:r>
-    </w:p>
-    <w:p>
-      <w:pPr>
-        <w:spacing w:after="120"/>
-      </w:pPr>
-      <w:r>
-        <w:rPr>
-          <w:i/>
-        </w:rPr>
-        <w:t>(Insert the full consensus sequence)</w:t>
-      </w:r>
-    </w:p>
-    <w:p>
-      <w:pPr>
-        <w:pStyle w:val="Heading2"/>
-        <w:spacing w:after="120"/>
-      </w:pPr>
-      <w:r>
-        <w:t>Appendix D: Output files generated</w:t>
+        <w:t>: Output files generated</w:t>
       </w:r>
     </w:p>
     <w:p>
@@ -1372,7 +1318,6 @@
         <w:spacing w:after="120"/>
       </w:pPr>
       <w:r>
-        <w:lastRenderedPageBreak/>
         <w:t>results/pairwise/local_alignment.txt</w:t>
       </w:r>
     </w:p>
@@ -1454,6 +1399,7 @@
         <w:spacing w:after="120"/>
       </w:pPr>
       <w:r>
+        <w:lastRenderedPageBreak/>
         <w:t>results/tables/msa_performance.csv</w:t>
       </w:r>
     </w:p>
@@ -1593,10 +1539,7 @@
       <w:jc w:val="center"/>
     </w:pPr>
     <w:r>
-      <w:t>S</w:t>
-    </w:r>
-    <w:r>
-      <w:t>equence alignment report</w:t>
+      <w:t>Sequence alignment report</w:t>
     </w:r>
   </w:p>
 </w:ftr>

</xml_diff>